<commit_message>
feat: retain current legal consents
</commit_message>
<xml_diff>
--- a/docs/legal/docx/08-order-data-transfer-consent.docx
+++ b/docs/legal/docx/08-order-data-transfer-consent.docx
@@ -8,7 +8,7 @@
         <w:jc w:val="left"/>
       </w:pPr>
       <w:r>
-        <w:t>Согласие на передачу данных ресторану и водителю</w:t>
+        <w:t>Согласие на передачу данных бизнесу и водителю</w:t>
       </w:r>
     </w:p>
     <w:p>
@@ -30,7 +30,7 @@
         <w:t>Редакция:</w:t>
       </w:r>
       <w:r>
-        <w:t xml:space="preserve"> 3.0 от 18 августа 2026 года</w:t>
+        <w:t xml:space="preserve"> 3.1 от 21 августа 2026 года</w:t>
       </w:r>
     </w:p>
     <w:p>
@@ -82,12 +82,17 @@
         <w:pStyle w:val="Heading1"/>
       </w:pPr>
       <w:r>
-        <w:t>1. Конкретная передача</w:t>
+        <w:t>1. Передача при заказах через аккаунт</w:t>
       </w:r>
     </w:p>
     <w:p>
       <w:r>
-        <w:t>При подтверждении заказа я разрешаю оператору передать выбранному мной ресторану: имя, телефон, состав/стоимость заказа, способ оплаты, комментарий, адрес и координаты при доставке. Назначенному водителю передаются: имя, телефон, адрес/координаты, ориентир, комментарий, сведения о получении заказа и необходимый статус оплаты без банковских реквизитов клиента.</w:t>
+        <w:t>Я разрешаю оператору при оформлении мной текущего и последующих заказов через мой аккаунт передавать данные только выбранному мной бизнесу и назначенному для конкретной доставки водителю. Бизнесу передаются: имя, телефон, состав/стоимость заказа, способ оплаты, комментарий, адрес и координаты при доставке. Назначенному водителю передаются: имя, телефон, адрес/координаты, ориентир, комментарий, сведения о получении заказа и необходимый статус оплаты без банковских реквизитов клиента.</w:t>
+      </w:r>
+    </w:p>
+    <w:p>
+      <w:r>
+        <w:t>Согласие действует до его отзыва либо до изменения целей, состава данных, категорий получателей или редакции документа. При таком изменении WayYaam запрашивает новое подтверждение. Наличие согласия не открывает данные всем бизнесам или водителям: каждый получатель видит их только в связи со своим заказом или назначенной доставкой.</w:t>
       </w:r>
     </w:p>
     <w:p>
@@ -100,7 +105,7 @@
     </w:p>
     <w:p>
       <w:r>
-        <w:t>Цель - принять, приготовить, доставить заказ и решить связанные обращения. Бизнесу и водителю запрещено использовать данные для собственной рекламы или посторонних целей. Рабочий доступ водителя к контактам и координатам клиента прекращается сразу после завершения или отмены доставки; ограниченные технические события доступны только уполномоченной поддержке в пределах срока хранения.</w:t>
+        <w:t>Цель - принять, собрать или приготовить, выдать и доставить заказ, а также решить связанные обращения. Бизнесу и водителю запрещено использовать данные для собственной рекламы или посторонних целей. Рабочий доступ водителя к контактам и координатам клиента прекращается сразу после завершения или отмены доставки; ограниченные технические события доступны только уполномоченной поддержке в пределах срока хранения.</w:t>
       </w:r>
     </w:p>
     <w:p>
@@ -126,7 +131,7 @@
     </w:p>
     <w:p>
       <w:r>
-        <w:t xml:space="preserve">До передачи согласие можно отозвать без последствий, кроме невозможности выполнить доставку. После передачи отзыв прекращает будущую необязательную обработку, но не отменяет законную обработку уже принятого заказа. Обращение: </w:t>
+        <w:t xml:space="preserve">Согласие можно отозвать через </w:t>
       </w:r>
       <w:r>
         <w:rPr>
@@ -136,7 +141,7 @@
         <w:t>privacy@wayyaam.ru</w:t>
       </w:r>
       <w:r>
-        <w:t>.</w:t>
+        <w:t>. Отзыв прекращает передачу для будущих заказов и иную будущую необязательную обработку, но не отменяет законную обработку уже принятого заказа. После отзыва оформление нового заказа, которому необходима такая передача, потребует нового согласия.</w:t>
       </w:r>
     </w:p>
     <w:sectPr>
@@ -161,7 +166,7 @@
       <w:rPr>
         <w:sz w:val="16"/>
       </w:rPr>
-      <w:t>WayYaam · 3.0 · privacy@wayyaam.ru</w:t>
+      <w:t>WayYaam · 3.1 · privacy@wayyaam.ru</w:t>
     </w:r>
   </w:p>
 </w:ftr>

</xml_diff>